<commit_message>
Texniki tapşırıq və təqdimatı hazır sistemə görə yenilə
</commit_message>
<xml_diff>
--- a/docs/Atalar-sozu-texniki-tapshiriq.docx
+++ b/docs/Atalar-sozu-texniki-tapshiriq.docx
@@ -41,7 +41,7 @@
           <w:color w:val="6B625A"/>
           <w:sz w:val="22"/>
         </w:rPr>
-        <w:t>İşlək sistemin analitik təsviri. Sənəd botun necə qurulduğunu, nə etdiyini və harada qəsdən bitmədiyini qeyd edir.</w:t>
+        <w:t>İşlək sistemin təsviri. Sənəd botun nə üçün qurulduğunu, nə etdiyini və necə işlədiyini əhatə edir.</w:t>
       </w:r>
     </w:p>
     <w:tbl>
@@ -122,7 +122,7 @@
                 <w:b w:val="0"/>
                 <w:sz w:val="20"/>
               </w:rPr>
-              <w:t>Texniki tapşırıq, versiya 1.0</w:t>
+              <w:t>Texniki tapşırıq, versiya 1.1</w:t>
             </w:r>
           </w:p>
         </w:tc>
@@ -158,7 +158,7 @@
                 <w:b w:val="0"/>
                 <w:sz w:val="20"/>
               </w:rPr>
-              <w:t>As-built: sistem işləyir, sonrakı redaktə üçün əsasdır</w:t>
+              <w:t>İşlək sistem</w:t>
             </w:r>
           </w:p>
         </w:tc>
@@ -228,7 +228,7 @@
                 <w:b w:val="0"/>
                 <w:sz w:val="20"/>
               </w:rPr>
-              <w:t>Yalnız Azərbaycan dili</w:t>
+              <w:t>Azərbaycan dili</w:t>
             </w:r>
           </w:p>
         </w:tc>
@@ -351,7 +351,7 @@
                 <w:b w:val="0"/>
                 <w:sz w:val="20"/>
               </w:rPr>
-              <w:t>Məlumat</w:t>
+              <w:t>Baza</w:t>
             </w:r>
           </w:p>
         </w:tc>
@@ -368,7 +368,7 @@
                 <w:b w:val="0"/>
                 <w:sz w:val="20"/>
               </w:rPr>
-              <w:t>3925 atalar sözü, proverbs.json</w:t>
+              <w:t>3913 atalar sözü</w:t>
             </w:r>
           </w:p>
         </w:tc>
@@ -397,7 +397,7 @@
           <w:b w:val="0"/>
           <w:sz w:val="22"/>
         </w:rPr>
-        <w:t>Bot Azərbaycan atalar sözünü axtarılan, oxunan və öyrənilən bir alətə çevirir. İstifadəçi açar söz, qısa hekayə və ya mövzu ilə söz tapır, təsadüfi və günün sözünü oxuyur, quizdə çatışmayan sözü tamamlayır. Hər gün saat 09:00-da eyni söz kanala da düşür.</w:t>
+        <w:t>Bot Azərbaycan atalar sözünü axtarılan, oxunan və öyrənilən bir xidmətə çevirir. İstifadəçi açar söz, qısa hekayə və ya mövzu ilə söz tapır, təsadüfi söz və günün sözünü oxuyur, quizdə çatışmayan sözü tamamlayır. Hər səhər saat 09:00-da həmin günün sözü kanala da düşür.</w:t>
       </w:r>
     </w:p>
     <w:p>
@@ -410,7 +410,7 @@
           <w:b w:val="0"/>
           <w:sz w:val="22"/>
         </w:rPr>
-        <w:t>Hədəf kütləsi geniş oxucudur: şagird, müəllim, valideyn və atalar sözünü gündəlik nitqdə işlətmək istəyən adam. Bot izahat vermir deyə qurulmayıb. İzah sahəsi var, lakin hazırda çox sözün izahı hələ yazılmayıb.</w:t>
+        <w:t>Xidmət şagird, müəllim, valideyn və atalar sözünü nitqində işlətmək istəyən oxucu üçündür. Dil bir dənədir: Azərbaycan dili. Hesab, ödəniş və başqa dil yoxdur.</w:t>
       </w:r>
     </w:p>
     <w:p>
@@ -422,32 +422,7 @@
           <w:rFonts w:ascii="Calibri" w:hAnsi="Calibri"/>
           <w:color w:val="9C2F2A"/>
         </w:rPr>
-        <w:t>2. Həll olunan problem</w:t>
-      </w:r>
-    </w:p>
-    <w:p>
-      <w:pPr>
-        <w:spacing w:after="160" w:before="0" w:line="269" w:lineRule="auto"/>
-      </w:pPr>
-      <w:r>
-        <w:rPr>
-          <w:rFonts w:ascii="Calibri" w:hAnsi="Calibri" w:eastAsia="Calibri"/>
-          <w:b w:val="0"/>
-          <w:sz w:val="22"/>
-        </w:rPr>
-        <w:t>Atalar sözü kitablarda və səpələnmiş səhifələrdə qalır. Adam konkret sözü, vəziyyətə uyğun sözü və ya mövzunu bir yerdə tapa bilmir. Bot bu üç boşluğu bağlayır: axtarış, seçim və gündəlik təkrar.</w:t>
-      </w:r>
-    </w:p>
-    <w:p>
-      <w:pPr>
-        <w:pStyle w:val="Heading1"/>
-      </w:pPr>
-      <w:r>
-        <w:rPr>
-          <w:rFonts w:ascii="Calibri" w:hAnsi="Calibri"/>
-          <w:color w:val="9C2F2A"/>
-        </w:rPr>
-        <w:t>3. Əhatə dairəsi</w:t>
+        <w:t>2. Əhatə</w:t>
       </w:r>
     </w:p>
     <w:p>
@@ -473,7 +448,7 @@
           <w:b w:val="0"/>
           <w:sz w:val="22"/>
         </w:rPr>
-        <w:t>• Telegram söhbəti: menyu, əmrlər, inline rejim.</w:t>
+        <w:t>• Telegram menyusu, əmrlər və inline rejim.</w:t>
       </w:r>
     </w:p>
     <w:p>
@@ -499,7 +474,7 @@
           <w:b w:val="0"/>
           <w:sz w:val="22"/>
         </w:rPr>
-        <w:t>• On bir mövzu, səhifələnmiş siyahı.</w:t>
+        <w:t>• On iki mövzu, səhifələnmiş siyahı.</w:t>
       </w:r>
     </w:p>
     <w:p>
@@ -564,7 +539,7 @@
           <w:b/>
           <w:sz w:val="22"/>
         </w:rPr>
-        <w:t>Sistemə daxil deyil</w:t>
+        <w:t>Sistemdən kənardadır</w:t>
       </w:r>
     </w:p>
     <w:p>
@@ -577,7 +552,7 @@
           <w:b w:val="0"/>
           <w:sz w:val="22"/>
         </w:rPr>
-        <w:t>• İstifadəçi hesabı, ödəniş, reytinq və statistika.</w:t>
+        <w:t>• İstifadəçi hesabı, ödəniş və reytinq.</w:t>
       </w:r>
     </w:p>
     <w:p>
@@ -590,7 +565,7 @@
           <w:b w:val="0"/>
           <w:sz w:val="22"/>
         </w:rPr>
-        <w:t>• Admin paneli və botun içindən bazanı redaktə.</w:t>
+        <w:t>• Botun içindən bazanı redaktə edən panel.</w:t>
       </w:r>
     </w:p>
     <w:p>
@@ -603,7 +578,7 @@
           <w:b w:val="0"/>
           <w:sz w:val="22"/>
         </w:rPr>
-        <w:t>• Webhook. Bot uzun sorğu (long polling) ilə işləyir.</w:t>
+        <w:t>• Webhook. Əlaqə uzun sorğu ilə qurulur.</w:t>
       </w:r>
     </w:p>
     <w:p>
@@ -616,20 +591,7 @@
           <w:b w:val="0"/>
           <w:sz w:val="22"/>
         </w:rPr>
-        <w:t>• Başqa dillər və tərcümə.</w:t>
-      </w:r>
-    </w:p>
-    <w:p>
-      <w:pPr>
-        <w:spacing w:after="40" w:before="0" w:line="269" w:lineRule="auto"/>
-      </w:pPr>
-      <w:r>
-        <w:rPr>
-          <w:rFonts w:ascii="Calibri" w:hAnsi="Calibri" w:eastAsia="Calibri"/>
-          <w:b w:val="0"/>
-          <w:sz w:val="22"/>
-        </w:rPr>
-        <w:t>• Kitabın ön sözü, şərhi və səhifə düzümü. Yalnız atalar sözünün mətni götürülüb.</w:t>
+        <w:t>• Tərcümə və başqa dillər.</w:t>
       </w:r>
     </w:p>
     <w:p>
@@ -641,7 +603,7 @@
           <w:rFonts w:ascii="Calibri" w:hAnsi="Calibri"/>
           <w:color w:val="9C2F2A"/>
         </w:rPr>
-        <w:t>4. Rollar</w:t>
+        <w:t>3. Rollar</w:t>
       </w:r>
     </w:p>
     <w:tbl>
@@ -688,7 +650,7 @@
                 <w:color w:val="FFFFFF"/>
                 <w:sz w:val="20"/>
               </w:rPr>
-              <w:t>Nə edir</w:t>
+              <w:t>Vəzifə</w:t>
             </w:r>
           </w:p>
         </w:tc>
@@ -758,7 +720,7 @@
                 <w:b w:val="0"/>
                 <w:sz w:val="20"/>
               </w:rPr>
-              <w:t>Hər səhər bir söz alır, bota keçə bilər.</w:t>
+              <w:t>Hər səhər bir söz alır və istəsə bota keçir.</w:t>
             </w:r>
           </w:p>
         </w:tc>
@@ -792,7 +754,7 @@
                 <w:b w:val="0"/>
                 <w:sz w:val="20"/>
               </w:rPr>
-              <w:t>Serverdə kodu yeniləyir və xidməti yenidən başladır. Tokenə baxır, onu paylaşmır.</w:t>
+              <w:t>Kodu serverdə yeniləyir və xidməti yenidən başladır.</w:t>
             </w:r>
           </w:p>
         </w:tc>
@@ -808,7 +770,7 @@
           <w:rFonts w:ascii="Calibri" w:hAnsi="Calibri"/>
           <w:color w:val="9C2F2A"/>
         </w:rPr>
-        <w:t>5. Funksional tələblər</w:t>
+        <w:t>4. Funksiyalar</w:t>
       </w:r>
     </w:p>
     <w:tbl>
@@ -844,7 +806,7 @@
         </w:tc>
         <w:tc>
           <w:tcPr>
-            <w:tcW w:type="dxa" w:w="4082"/>
+            <w:tcW w:type="dxa" w:w="2381"/>
             <w:shd w:fill="1A1614" w:val="clear"/>
           </w:tcPr>
           <w:p>
@@ -856,13 +818,13 @@
                 <w:color w:val="FFFFFF"/>
                 <w:sz w:val="20"/>
               </w:rPr>
-              <w:t>Tələb</w:t>
+              <w:t>Funksiya</w:t>
             </w:r>
           </w:p>
         </w:tc>
         <w:tc>
           <w:tcPr>
-            <w:tcW w:type="dxa" w:w="4309"/>
+            <w:tcW w:type="dxa" w:w="6009"/>
             <w:shd w:fill="1A1614" w:val="clear"/>
           </w:tcPr>
           <w:p>
@@ -874,7 +836,7 @@
                 <w:color w:val="FFFFFF"/>
                 <w:sz w:val="20"/>
               </w:rPr>
-              <w:t>Qəbul meyarı</w:t>
+              <w:t>Necə işləyir</w:t>
             </w:r>
           </w:p>
         </w:tc>
@@ -898,7 +860,7 @@
         </w:tc>
         <w:tc>
           <w:tcPr>
-            <w:tcW w:type="dxa" w:w="4082"/>
+            <w:tcW w:type="dxa" w:w="2381"/>
           </w:tcPr>
           <w:p>
             <w:r/>
@@ -908,13 +870,13 @@
                 <w:b w:val="0"/>
                 <w:sz w:val="20"/>
               </w:rPr>
-              <w:t>Başlanğıc menyusu və söz sayı.</w:t>
+              <w:t>Başlanğıc</w:t>
             </w:r>
           </w:p>
         </w:tc>
         <w:tc>
           <w:tcPr>
-            <w:tcW w:type="dxa" w:w="4309"/>
+            <w:tcW w:type="dxa" w:w="6009"/>
           </w:tcPr>
           <w:p>
             <w:r/>
@@ -924,7 +886,7 @@
                 <w:b w:val="0"/>
                 <w:sz w:val="20"/>
               </w:rPr>
-              <w:t>/start bazadakı sayını və düymələri göstərir.</w:t>
+              <w:t>/start söz sayını və menyunu açır.</w:t>
             </w:r>
           </w:p>
         </w:tc>
@@ -949,7 +911,7 @@
         </w:tc>
         <w:tc>
           <w:tcPr>
-            <w:tcW w:type="dxa" w:w="4082"/>
+            <w:tcW w:type="dxa" w:w="2381"/>
             <w:shd w:fill="F6F1E7" w:val="clear"/>
           </w:tcPr>
           <w:p>
@@ -960,13 +922,13 @@
                 <w:b w:val="0"/>
                 <w:sz w:val="20"/>
               </w:rPr>
-              <w:t>Açar söz axtarışı, ən çox 8 nəticə.</w:t>
+              <w:t>Açar söz</w:t>
             </w:r>
           </w:p>
         </w:tc>
         <w:tc>
           <w:tcPr>
-            <w:tcW w:type="dxa" w:w="4309"/>
+            <w:tcW w:type="dxa" w:w="6009"/>
             <w:shd w:fill="F6F1E7" w:val="clear"/>
           </w:tcPr>
           <w:p>
@@ -977,7 +939,7 @@
                 <w:b w:val="0"/>
                 <w:sz w:val="20"/>
               </w:rPr>
-              <w:t>«dost» yazılanda mətnində və ya açarlarında uyğun sözlər gəlir.</w:t>
+              <w:t>Bir və ya bir neçə söz yazılır. Ən çox 8 nəticə qayıdır.</w:t>
             </w:r>
           </w:p>
         </w:tc>
@@ -1001,7 +963,7 @@
         </w:tc>
         <w:tc>
           <w:tcPr>
-            <w:tcW w:type="dxa" w:w="4082"/>
+            <w:tcW w:type="dxa" w:w="2381"/>
           </w:tcPr>
           <w:p>
             <w:r/>
@@ -1011,13 +973,13 @@
                 <w:b w:val="0"/>
                 <w:sz w:val="20"/>
               </w:rPr>
-              <w:t>Hekayə axtarışı, ən çox 3 nəticə.</w:t>
+              <w:t>Hekayə</w:t>
             </w:r>
           </w:p>
         </w:tc>
         <w:tc>
           <w:tcPr>
-            <w:tcW w:type="dxa" w:w="4309"/>
+            <w:tcW w:type="dxa" w:w="6009"/>
           </w:tcPr>
           <w:p>
             <w:r/>
@@ -1027,7 +989,7 @@
                 <w:b w:val="0"/>
                 <w:sz w:val="20"/>
               </w:rPr>
-              <w:t>Qısa vəziyyət mətnindən mövzu tutulur və yaxın söz seçilir.</w:t>
+              <w:t>Qısa vəziyyət yazılır. Ən çox 3 yaxın söz seçilir.</w:t>
             </w:r>
           </w:p>
         </w:tc>
@@ -1052,7 +1014,7 @@
         </w:tc>
         <w:tc>
           <w:tcPr>
-            <w:tcW w:type="dxa" w:w="4082"/>
+            <w:tcW w:type="dxa" w:w="2381"/>
             <w:shd w:fill="F6F1E7" w:val="clear"/>
           </w:tcPr>
           <w:p>
@@ -1063,13 +1025,13 @@
                 <w:b w:val="0"/>
                 <w:sz w:val="20"/>
               </w:rPr>
-              <w:t>Təsadüfi söz.</w:t>
+              <w:t>Təsadüfi</w:t>
             </w:r>
           </w:p>
         </w:tc>
         <w:tc>
           <w:tcPr>
-            <w:tcW w:type="dxa" w:w="4309"/>
+            <w:tcW w:type="dxa" w:w="6009"/>
             <w:shd w:fill="F6F1E7" w:val="clear"/>
           </w:tcPr>
           <w:p>
@@ -1080,7 +1042,7 @@
                 <w:b w:val="0"/>
                 <w:sz w:val="20"/>
               </w:rPr>
-              <w:t>Hər basışda bazadan bir söz, mənası və mövzusu ilə.</w:t>
+              <w:t>Bazadan bir söz, mənası və mövzusu ilə.</w:t>
             </w:r>
           </w:p>
         </w:tc>
@@ -1104,7 +1066,7 @@
         </w:tc>
         <w:tc>
           <w:tcPr>
-            <w:tcW w:type="dxa" w:w="4082"/>
+            <w:tcW w:type="dxa" w:w="2381"/>
           </w:tcPr>
           <w:p>
             <w:r/>
@@ -1114,13 +1076,13 @@
                 <w:b w:val="0"/>
                 <w:sz w:val="20"/>
               </w:rPr>
-              <w:t>Mövzu siyahısı.</w:t>
+              <w:t>Mövzular</w:t>
             </w:r>
           </w:p>
         </w:tc>
         <w:tc>
           <w:tcPr>
-            <w:tcW w:type="dxa" w:w="4309"/>
+            <w:tcW w:type="dxa" w:w="6009"/>
           </w:tcPr>
           <w:p>
             <w:r/>
@@ -1130,7 +1092,7 @@
                 <w:b w:val="0"/>
                 <w:sz w:val="20"/>
               </w:rPr>
-              <w:t>Düymədə say görünür. Səhifədə 15 söz olur. İrəli və Geri işləyir.</w:t>
+              <w:t>On iki qutu. Düymədə say görünür. Səhifədə 15 söz.</w:t>
             </w:r>
           </w:p>
         </w:tc>
@@ -1155,7 +1117,7 @@
         </w:tc>
         <w:tc>
           <w:tcPr>
-            <w:tcW w:type="dxa" w:w="4082"/>
+            <w:tcW w:type="dxa" w:w="2381"/>
             <w:shd w:fill="F6F1E7" w:val="clear"/>
           </w:tcPr>
           <w:p>
@@ -1166,13 +1128,13 @@
                 <w:b w:val="0"/>
                 <w:sz w:val="20"/>
               </w:rPr>
-              <w:t>Günün sözü.</w:t>
+              <w:t>Günün sözü</w:t>
             </w:r>
           </w:p>
         </w:tc>
         <w:tc>
           <w:tcPr>
-            <w:tcW w:type="dxa" w:w="4309"/>
+            <w:tcW w:type="dxa" w:w="6009"/>
             <w:shd w:fill="F6F1E7" w:val="clear"/>
           </w:tcPr>
           <w:p>
@@ -1183,7 +1145,7 @@
                 <w:b w:val="0"/>
                 <w:sz w:val="20"/>
               </w:rPr>
-              <w:t>Eyni təqvim günündə hamıya eyni söz. Növbəti gün dəyişir.</w:t>
+              <w:t>Eyni gündə hamıya eyni söz. Növbəti gün dəyişir.</w:t>
             </w:r>
           </w:p>
         </w:tc>
@@ -1207,7 +1169,7 @@
         </w:tc>
         <w:tc>
           <w:tcPr>
-            <w:tcW w:type="dxa" w:w="4082"/>
+            <w:tcW w:type="dxa" w:w="2381"/>
           </w:tcPr>
           <w:p>
             <w:r/>
@@ -1217,13 +1179,13 @@
                 <w:b w:val="0"/>
                 <w:sz w:val="20"/>
               </w:rPr>
-              <w:t>Kanal.</w:t>
+              <w:t>Kanal</w:t>
             </w:r>
           </w:p>
         </w:tc>
         <w:tc>
           <w:tcPr>
-            <w:tcW w:type="dxa" w:w="4309"/>
+            <w:tcW w:type="dxa" w:w="6009"/>
           </w:tcPr>
           <w:p>
             <w:r/>
@@ -1233,7 +1195,7 @@
                 <w:b w:val="0"/>
                 <w:sz w:val="20"/>
               </w:rPr>
-              <w:t>Hər gün Bakı vaxtı ilə 09:00-da @atalarimizinsozu kanalına göndərilir.</w:t>
+              <w:t>Hər gün Bakı vaxtı ilə 09:00-da @atalarimizinsozu.</w:t>
             </w:r>
           </w:p>
         </w:tc>
@@ -1258,7 +1220,7 @@
         </w:tc>
         <w:tc>
           <w:tcPr>
-            <w:tcW w:type="dxa" w:w="4082"/>
+            <w:tcW w:type="dxa" w:w="2381"/>
             <w:shd w:fill="F6F1E7" w:val="clear"/>
           </w:tcPr>
           <w:p>
@@ -1269,13 +1231,13 @@
                 <w:b w:val="0"/>
                 <w:sz w:val="20"/>
               </w:rPr>
-              <w:t>Inline.</w:t>
+              <w:t>Inline</w:t>
             </w:r>
           </w:p>
         </w:tc>
         <w:tc>
           <w:tcPr>
-            <w:tcW w:type="dxa" w:w="4309"/>
+            <w:tcW w:type="dxa" w:w="6009"/>
             <w:shd w:fill="F6F1E7" w:val="clear"/>
           </w:tcPr>
           <w:p>
@@ -1286,7 +1248,7 @@
                 <w:b w:val="0"/>
                 <w:sz w:val="20"/>
               </w:rPr>
-              <w:t>İstənilən söhbətdə @AtalarSozleri_bot və açar söz yazılanda nəticə ora göndərilir.</w:t>
+              <w:t>İstənilən söhbətdə @AtalarSozleri_bot və açar söz.</w:t>
             </w:r>
           </w:p>
         </w:tc>
@@ -1310,7 +1272,7 @@
         </w:tc>
         <w:tc>
           <w:tcPr>
-            <w:tcW w:type="dxa" w:w="4082"/>
+            <w:tcW w:type="dxa" w:w="2381"/>
           </w:tcPr>
           <w:p>
             <w:r/>
@@ -1320,13 +1282,13 @@
                 <w:b w:val="0"/>
                 <w:sz w:val="20"/>
               </w:rPr>
-              <w:t>Quiz.</w:t>
+              <w:t>Quiz</w:t>
             </w:r>
           </w:p>
         </w:tc>
         <w:tc>
           <w:tcPr>
-            <w:tcW w:type="dxa" w:w="4309"/>
+            <w:tcW w:type="dxa" w:w="6009"/>
           </w:tcPr>
           <w:p>
             <w:r/>
@@ -1336,7 +1298,7 @@
                 <w:b w:val="0"/>
                 <w:sz w:val="20"/>
               </w:rPr>
-              <w:t>Bir mənalı söz nöqtə ilə gizlənir. Düz cavabda təbrik və izah. Səhv cavabda sual qalır.</w:t>
+              <w:t>Mənalı söz nöqtə ilə gizlənir. Düz cavabda təbrik və izah.</w:t>
             </w:r>
           </w:p>
         </w:tc>
@@ -1361,7 +1323,7 @@
         </w:tc>
         <w:tc>
           <w:tcPr>
-            <w:tcW w:type="dxa" w:w="4082"/>
+            <w:tcW w:type="dxa" w:w="2381"/>
             <w:shd w:fill="F6F1E7" w:val="clear"/>
           </w:tcPr>
           <w:p>
@@ -1372,13 +1334,13 @@
                 <w:b w:val="0"/>
                 <w:sz w:val="20"/>
               </w:rPr>
-              <w:t>Pas.</w:t>
+              <w:t>Pas</w:t>
             </w:r>
           </w:p>
         </w:tc>
         <w:tc>
           <w:tcPr>
-            <w:tcW w:type="dxa" w:w="4309"/>
+            <w:tcW w:type="dxa" w:w="6009"/>
             <w:shd w:fill="F6F1E7" w:val="clear"/>
           </w:tcPr>
           <w:p>
@@ -1389,7 +1351,7 @@
                 <w:b w:val="0"/>
                 <w:sz w:val="20"/>
               </w:rPr>
-              <w:t>İstifadəçi tapa bilməyəndə bot sözü açır və izahı verir.</w:t>
+              <w:t>Cavab tapılmayanda bot sözü açır və izahı verir.</w:t>
             </w:r>
           </w:p>
         </w:tc>
@@ -1413,7 +1375,7 @@
         </w:tc>
         <w:tc>
           <w:tcPr>
-            <w:tcW w:type="dxa" w:w="4082"/>
+            <w:tcW w:type="dxa" w:w="2381"/>
           </w:tcPr>
           <w:p>
             <w:r/>
@@ -1423,13 +1385,13 @@
                 <w:b w:val="0"/>
                 <w:sz w:val="20"/>
               </w:rPr>
-              <w:t>Ləğv.</w:t>
+              <w:t>Ləğv</w:t>
             </w:r>
           </w:p>
         </w:tc>
         <w:tc>
           <w:tcPr>
-            <w:tcW w:type="dxa" w:w="4309"/>
+            <w:tcW w:type="dxa" w:w="6009"/>
           </w:tcPr>
           <w:p>
             <w:r/>
@@ -1439,7 +1401,7 @@
                 <w:b w:val="0"/>
                 <w:sz w:val="20"/>
               </w:rPr>
-              <w:t>/legv axtarışı və quizi dayandırır, menyuya qaytarır.</w:t>
+              <w:t>/legv axtarışı və quizi dayandırır.</w:t>
             </w:r>
           </w:p>
         </w:tc>
@@ -1464,7 +1426,7 @@
         </w:tc>
         <w:tc>
           <w:tcPr>
-            <w:tcW w:type="dxa" w:w="4082"/>
+            <w:tcW w:type="dxa" w:w="2381"/>
             <w:shd w:fill="F6F1E7" w:val="clear"/>
           </w:tcPr>
           <w:p>
@@ -1475,13 +1437,13 @@
                 <w:b w:val="0"/>
                 <w:sz w:val="20"/>
               </w:rPr>
-              <w:t>Fasiləsiz iş.</w:t>
+              <w:t>Fasiləsiz iş</w:t>
             </w:r>
           </w:p>
         </w:tc>
         <w:tc>
           <w:tcPr>
-            <w:tcW w:type="dxa" w:w="4309"/>
+            <w:tcW w:type="dxa" w:w="6009"/>
             <w:shd w:fill="F6F1E7" w:val="clear"/>
           </w:tcPr>
           <w:p>
@@ -1492,7 +1454,7 @@
                 <w:b w:val="0"/>
                 <w:sz w:val="20"/>
               </w:rPr>
-              <w:t>Terminal bağlansa da proses systemd altında qalır və xətada 5 saniyəyə yenidən qalxır.</w:t>
+              <w:t>Xidmət systemd altındadır və özü yenidən qalxır.</w:t>
             </w:r>
           </w:p>
         </w:tc>
@@ -1508,7 +1470,7 @@
           <w:rFonts w:ascii="Calibri" w:hAnsi="Calibri"/>
           <w:color w:val="9C2F2A"/>
         </w:rPr>
-        <w:t>6. Məlumat modeli</w:t>
+        <w:t>5. Məlumat</w:t>
       </w:r>
     </w:p>
     <w:p>
@@ -1521,7 +1483,7 @@
           <w:b w:val="0"/>
           <w:sz w:val="22"/>
         </w:rPr>
-        <w:t>Baza ayrıca verilənlər bazası deyil. Bir JSON faylıdır: proverbs.json. Proses açılanda fayl yaddaşa oxunur. Yeni söz diskə yazılandan sonra bot yenidən başladılmalıdır.</w:t>
+        <w:t>Baza proverbs.json faylıdır. Proses açılanda fayl yaddaşa oxunur. Hər yazıda dörd sahə var.</w:t>
       </w:r>
     </w:p>
     <w:tbl>
@@ -1602,7 +1564,7 @@
                 <w:b w:val="0"/>
                 <w:sz w:val="20"/>
               </w:rPr>
-              <w:t>Sıra nömrəsi, 1-dən başlayır.</w:t>
+              <w:t>Sıra nömrəsi.</w:t>
             </w:r>
           </w:p>
         </w:tc>
@@ -1638,7 +1600,7 @@
                 <w:b w:val="0"/>
                 <w:sz w:val="20"/>
               </w:rPr>
-              <w:t>Atalar sözünün özü.</w:t>
+              <w:t>Atalar sözünün mətni.</w:t>
             </w:r>
           </w:p>
         </w:tc>
@@ -1672,7 +1634,7 @@
                 <w:b w:val="0"/>
                 <w:sz w:val="20"/>
               </w:rPr>
-              <w:t>Qısa izah. Çoxunda hələ «Xalq öyüdü.» yazılıb.</w:t>
+              <w:t>Qısa izah.</w:t>
             </w:r>
           </w:p>
         </w:tc>
@@ -1742,7 +1704,7 @@
                 <w:b w:val="0"/>
                 <w:sz w:val="20"/>
               </w:rPr>
-              <w:t>Tək mövzu adı. Siyahıdır, hazırda bir element saxlayır.</w:t>
+              <w:t>Sözün mövzusu.</w:t>
             </w:r>
           </w:p>
         </w:tc>
@@ -1759,7 +1721,19 @@
           <w:b w:val="0"/>
           <w:sz w:val="22"/>
         </w:rPr>
-        <w:t>Mənbə qeydi meta sahəsindədir: «Atalar sözü», Öndər nəşriyyat, Bakı, 2004, səhifə 17–247. Tərtib: Cəlal Bəydili. Kitaba ön söz və şərh köçürülməyib. İzahlar bot üçün ayrıca yazılıb və ya hələ yer tutucudur.</w:t>
+        <w:t>Mənbə: «Atalar sözü», Öndər nəşriyyat, Bakı, 2004, səhifə 17–247. Tərtib: Cəlal Bəydili. Bazada 3913 söz var.</w:t>
+      </w:r>
+    </w:p>
+    <w:p>
+      <w:pPr>
+        <w:pStyle w:val="Heading1"/>
+      </w:pPr>
+      <w:r>
+        <w:rPr>
+          <w:rFonts w:ascii="Calibri" w:hAnsi="Calibri"/>
+          <w:color w:val="9C2F2A"/>
+        </w:rPr>
+        <w:t>6. Axtarış</w:t>
       </w:r>
     </w:p>
     <w:p>
@@ -1772,19 +1746,7 @@
           <w:b w:val="0"/>
           <w:sz w:val="22"/>
         </w:rPr>
-        <w:t>Say: 3925 unikal söz. Yaxın variantlar eyni açarla birləşdirilib. Əvvəlki əl ilə yığılmış 150 söz bazadan çıxarılıb. Onlardan yalnız kitabda da olan 27-si PDF mətnində qalıb.</w:t>
-      </w:r>
-    </w:p>
-    <w:p>
-      <w:pPr>
-        <w:pStyle w:val="Heading1"/>
-      </w:pPr>
-      <w:r>
-        <w:rPr>
-          <w:rFonts w:ascii="Calibri" w:hAnsi="Calibri"/>
-          <w:color w:val="9C2F2A"/>
-        </w:rPr>
-        <w:t>7. Axtarış qaydası</w:t>
+        <w:t>Sorğu və mətn eyni qayda ilə normallaşır. Hərflər kiçildilir, ə→e, ı→i, ö→o, ü→u, ğ→g, ş→s, ç→c. Durğu işarəsi boşluğa çevrilir. Beləliklə hərf fərqi axtarışı pozmur.</w:t>
       </w:r>
     </w:p>
     <w:p>
@@ -1797,7 +1759,7 @@
           <w:b w:val="0"/>
           <w:sz w:val="22"/>
         </w:rPr>
-        <w:t>Sorğu və mətn eyni qayda ilə normallaşır: hərflər kiçildilir, ə→e, ı→i, ö→o, ü→u, ğ→g, ş→s, ç→c. Durğu işarəsi boşluğa çevrilir. Beləliklə «elm» və «elm» eyni açardır, «ş» ilə «s» də bir-birini tutur.</w:t>
+        <w:t>Açar söz axtarışı mətnə, izaha, açar sözlərə və mövzuya baxır. Tam uyğunluq daha yüksək bal alır. Nəticə 8 ilə kəsilir.</w:t>
       </w:r>
     </w:p>
     <w:p>
@@ -1810,7 +1772,19 @@
           <w:b w:val="0"/>
           <w:sz w:val="22"/>
         </w:rPr>
-        <w:t>Açar söz axtarışı bütün sözün mətninə, izahına, açarlarına və mövzusuna baxır. Tam uyğunluq daha yüksək bal alır. Nəticə 8 ilə kəsilir.</w:t>
+        <w:t>Hekayə axtarışı vəziyyət sözlərini tanıyır: dost, borc, ana, qorxu, elm və bu qəbildən olanlar. Sonra həmin vəziyyətə uyğun sözlərə əlavə bal verir. Nəticə 3 ilə kəsilir.</w:t>
+      </w:r>
+    </w:p>
+    <w:p>
+      <w:pPr>
+        <w:pStyle w:val="Heading1"/>
+      </w:pPr>
+      <w:r>
+        <w:rPr>
+          <w:rFonts w:ascii="Calibri" w:hAnsi="Calibri"/>
+          <w:color w:val="9C2F2A"/>
+        </w:rPr>
+        <w:t>7. Quiz</w:t>
       </w:r>
     </w:p>
     <w:p>
@@ -1823,32 +1797,7 @@
           <w:b w:val="0"/>
           <w:sz w:val="22"/>
         </w:rPr>
-        <w:t>Hekayə axtarışı əvvəlcə vəziyyət sözlərini tanıyır. Məsələn dost, borc, ana, qorxu, elm. Sonra həmin vəziyyətə uyğun sözlərə əlavə bal verir. Nəticə 3 ilə kəsilir. Bu, süni intellekt modeli deyil. Əl ilə yazılmış vəziyyət cədvəlidir.</w:t>
-      </w:r>
-    </w:p>
-    <w:p>
-      <w:pPr>
-        <w:pStyle w:val="Heading1"/>
-      </w:pPr>
-      <w:r>
-        <w:rPr>
-          <w:rFonts w:ascii="Calibri" w:hAnsi="Calibri"/>
-          <w:color w:val="9C2F2A"/>
-        </w:rPr>
-        <w:t>8. Quiz qaydası</w:t>
-      </w:r>
-    </w:p>
-    <w:p>
-      <w:pPr>
-        <w:spacing w:after="160" w:before="0" w:line="269" w:lineRule="auto"/>
-      </w:pPr>
-      <w:r>
-        <w:rPr>
-          <w:rFonts w:ascii="Calibri" w:hAnsi="Calibri" w:eastAsia="Calibri"/>
-          <w:b w:val="0"/>
-          <w:sz w:val="22"/>
-        </w:rPr>
-        <w:t>Bot təsadüfi söz seçir. Mənanı daşıyan bir sözü «……» ilə əvəz edir. Qısa köməkçi sözlər və yüngül feillər gizlədilmir. İstifadəçi sözü yazır.</w:t>
+        <w:t>Bot təsadüfi söz seçir və mənanı daşıyan bir sözü «……» ilə əvəz edir. Qısa köməkçi söz gizlədilmir. İstifadəçi çatışmayan sözü yazır.</w:t>
       </w:r>
     </w:p>
     <w:tbl>
@@ -1895,7 +1844,7 @@
                 <w:color w:val="FFFFFF"/>
                 <w:sz w:val="20"/>
               </w:rPr>
-              <w:t>Botun reaksiyası</w:t>
+              <w:t>Bot</w:t>
             </w:r>
           </w:p>
         </w:tc>
@@ -1929,7 +1878,7 @@
                 <w:b w:val="0"/>
                 <w:sz w:val="20"/>
               </w:rPr>
-              <w:t>«Düzdür. Təbrik edirəm.» Tam söz və izah. Menyu qayıdır.</w:t>
+              <w:t>Təbrik, tam söz və izah. Menyu qayıdır.</w:t>
             </w:r>
           </w:p>
         </w:tc>
@@ -1965,7 +1914,7 @@
                 <w:b w:val="0"/>
                 <w:sz w:val="20"/>
               </w:rPr>
-              <w:t>Cavab açılmır. Eyni sual təkrar olunur. Doğru sözə qədər davam edir.</w:t>
+              <w:t>Cavab açılmır. Eyni sual qalır.</w:t>
             </w:r>
           </w:p>
         </w:tc>
@@ -2016,7 +1965,7 @@
           <w:b w:val="0"/>
           <w:sz w:val="22"/>
         </w:rPr>
-        <w:t>Yoxlama böyük-kiçik hərfə və ə/e fərqinə baxmır. Qısa şəkilçi fərqi, məsələn «qurd» və «qurdu», düz sayılır. Üç sözdən uzun cümlənin içinə sözü gizlətmək düz cavab sayılmır.</w:t>
+        <w:t>Yoxlama böyük-kiçik hərfə və ə/e fərqinə baxmır. Qısa şəkilçi fərqi, məsələn «qurd» və «qurdu», düz sayılır.</w:t>
       </w:r>
     </w:p>
     <w:p>
@@ -2028,7 +1977,7 @@
           <w:rFonts w:ascii="Calibri" w:hAnsi="Calibri"/>
           <w:color w:val="9C2F2A"/>
         </w:rPr>
-        <w:t>9. Mövzular və məlum qüsur</w:t>
+        <w:t>8. Mövzular</w:t>
       </w:r>
     </w:p>
     <w:p>
@@ -2041,7 +1990,7 @@
           <w:b w:val="0"/>
           <w:sz w:val="22"/>
         </w:rPr>
-        <w:t>Mövzu siyahısı kodda sabitdir. Hər sözə avtomatik bir mövzu yazılıb. Qayda sözün içindəki açar sözə baxır. Açar tutmayanda söz Əxlaq qutusuna düşür. Buna görə bölgü hələ redaktə olunmayıb.</w:t>
+        <w:t>Kolleksiya on iki mövzuya bölünüb. Mövzu siyahısı kodda sabitdir. Düymədə həmin qutudakı söz sayı yazılır.</w:t>
       </w:r>
     </w:p>
     <w:tbl>
@@ -2077,7 +2026,7 @@
         </w:tc>
         <w:tc>
           <w:tcPr>
-            <w:tcW w:type="dxa" w:w="1701"/>
+            <w:tcW w:type="dxa" w:w="1361"/>
             <w:shd w:fill="1A1614" w:val="clear"/>
           </w:tcPr>
           <w:p>
@@ -2089,13 +2038,13 @@
                 <w:color w:val="FFFFFF"/>
                 <w:sz w:val="20"/>
               </w:rPr>
-              <w:t>Söz sayı</w:t>
+              <w:t>Say</w:t>
             </w:r>
           </w:p>
         </w:tc>
         <w:tc>
           <w:tcPr>
-            <w:tcW w:type="dxa" w:w="5556"/>
+            <w:tcW w:type="dxa" w:w="5896"/>
             <w:shd w:fill="1A1614" w:val="clear"/>
           </w:tcPr>
           <w:p>
@@ -2107,7 +2056,7 @@
                 <w:color w:val="FFFFFF"/>
                 <w:sz w:val="20"/>
               </w:rPr>
-              <w:t>Nəyə baxır</w:t>
+              <w:t>Nəyi tutur</w:t>
             </w:r>
           </w:p>
         </w:tc>
@@ -2125,13 +2074,13 @@
                 <w:b w:val="0"/>
                 <w:sz w:val="20"/>
               </w:rPr>
-              <w:t>Əxlaq</w:t>
+              <w:t>Nəsihət</w:t>
             </w:r>
           </w:p>
         </w:tc>
         <w:tc>
           <w:tcPr>
-            <w:tcW w:type="dxa" w:w="1701"/>
+            <w:tcW w:type="dxa" w:w="1361"/>
           </w:tcPr>
           <w:p>
             <w:r/>
@@ -2141,13 +2090,13 @@
                 <w:b w:val="0"/>
                 <w:sz w:val="20"/>
               </w:rPr>
-              <w:t>3324</w:t>
+              <w:t>2751</w:t>
             </w:r>
           </w:p>
         </w:tc>
         <w:tc>
           <w:tcPr>
-            <w:tcW w:type="dxa" w:w="5556"/>
+            <w:tcW w:type="dxa" w:w="5896"/>
           </w:tcPr>
           <w:p>
             <w:r/>
@@ -2157,7 +2106,7 @@
                 <w:b w:val="0"/>
                 <w:sz w:val="20"/>
               </w:rPr>
-              <w:t>Heç bir xüsusi açar tutmayanda bura düşür.</w:t>
+              <w:t>Gündəlik öyüd və həyat müşahidəsi</w:t>
             </w:r>
           </w:p>
         </w:tc>
@@ -2182,7 +2131,7 @@
         </w:tc>
         <w:tc>
           <w:tcPr>
-            <w:tcW w:type="dxa" w:w="1701"/>
+            <w:tcW w:type="dxa" w:w="1361"/>
             <w:shd w:fill="F6F1E7" w:val="clear"/>
           </w:tcPr>
           <w:p>
@@ -2193,13 +2142,13 @@
                 <w:b w:val="0"/>
                 <w:sz w:val="20"/>
               </w:rPr>
-              <w:t>209</w:t>
+              <w:t>304</w:t>
             </w:r>
           </w:p>
         </w:tc>
         <w:tc>
           <w:tcPr>
-            <w:tcW w:type="dxa" w:w="5556"/>
+            <w:tcW w:type="dxa" w:w="5896"/>
             <w:shd w:fill="F6F1E7" w:val="clear"/>
           </w:tcPr>
           <w:p>
@@ -2210,7 +2159,7 @@
                 <w:b w:val="0"/>
                 <w:sz w:val="20"/>
               </w:rPr>
-              <w:t>ana, ata, övlad, uşaq, gəlin, arvad və yaxınları</w:t>
+              <w:t>Ana, ata, övlad, arvad, qardaş</w:t>
             </w:r>
           </w:p>
         </w:tc>
@@ -2234,7 +2183,7 @@
         </w:tc>
         <w:tc>
           <w:tcPr>
-            <w:tcW w:type="dxa" w:w="1701"/>
+            <w:tcW w:type="dxa" w:w="1361"/>
           </w:tcPr>
           <w:p>
             <w:r/>
@@ -2244,13 +2193,13 @@
                 <w:b w:val="0"/>
                 <w:sz w:val="20"/>
               </w:rPr>
-              <w:t>111</w:t>
+              <w:t>189</w:t>
             </w:r>
           </w:p>
         </w:tc>
         <w:tc>
           <w:tcPr>
-            <w:tcW w:type="dxa" w:w="5556"/>
+            <w:tcW w:type="dxa" w:w="5896"/>
           </w:tcPr>
           <w:p>
             <w:r/>
@@ -2260,7 +2209,7 @@
                 <w:b w:val="0"/>
                 <w:sz w:val="20"/>
               </w:rPr>
-              <w:t>ağıl, söz, yalan, sirr, ehtiyat</w:t>
+              <w:t>Söz, dil, yalan, ağıl, ehtiyat</w:t>
             </w:r>
           </w:p>
         </w:tc>
@@ -2279,13 +2228,13 @@
                 <w:b w:val="0"/>
                 <w:sz w:val="20"/>
               </w:rPr>
-              <w:t>Dostluq</w:t>
+              <w:t>Bərəkət</w:t>
             </w:r>
           </w:p>
         </w:tc>
         <w:tc>
           <w:tcPr>
-            <w:tcW w:type="dxa" w:w="1701"/>
+            <w:tcW w:type="dxa" w:w="1361"/>
             <w:shd w:fill="F6F1E7" w:val="clear"/>
           </w:tcPr>
           <w:p>
@@ -2296,13 +2245,13 @@
                 <w:b w:val="0"/>
                 <w:sz w:val="20"/>
               </w:rPr>
-              <w:t>97</w:t>
+              <w:t>171</w:t>
             </w:r>
           </w:p>
         </w:tc>
         <w:tc>
           <w:tcPr>
-            <w:tcW w:type="dxa" w:w="5556"/>
+            <w:tcW w:type="dxa" w:w="5896"/>
             <w:shd w:fill="F6F1E7" w:val="clear"/>
           </w:tcPr>
           <w:p>
@@ -2313,7 +2262,7 @@
                 <w:b w:val="0"/>
                 <w:sz w:val="20"/>
               </w:rPr>
-              <w:t>dost, yoldaş, düşmən</w:t>
+              <w:t>Ruzi, aclıq, kasıb, dövlət, borc</w:t>
             </w:r>
           </w:p>
         </w:tc>
@@ -2331,13 +2280,13 @@
                 <w:b w:val="0"/>
                 <w:sz w:val="20"/>
               </w:rPr>
-              <w:t>Bərəkət</w:t>
+              <w:t>Əxlaq</w:t>
             </w:r>
           </w:p>
         </w:tc>
         <w:tc>
           <w:tcPr>
-            <w:tcW w:type="dxa" w:w="1701"/>
+            <w:tcW w:type="dxa" w:w="1361"/>
           </w:tcPr>
           <w:p>
             <w:r/>
@@ -2347,13 +2296,13 @@
                 <w:b w:val="0"/>
                 <w:sz w:val="20"/>
               </w:rPr>
-              <w:t>53</w:t>
+              <w:t>149</w:t>
             </w:r>
           </w:p>
         </w:tc>
         <w:tc>
           <w:tcPr>
-            <w:tcW w:type="dxa" w:w="5556"/>
+            <w:tcW w:type="dxa" w:w="5896"/>
           </w:tcPr>
           <w:p>
             <w:r/>
@@ -2363,7 +2312,7 @@
                 <w:b w:val="0"/>
                 <w:sz w:val="20"/>
               </w:rPr>
-              <w:t>bərəkət, ruzi, qismət, borc</w:t>
+              <w:t>Haqq, haram, vəfa, namus, zülm</w:t>
             </w:r>
           </w:p>
         </w:tc>
@@ -2388,7 +2337,7 @@
         </w:tc>
         <w:tc>
           <w:tcPr>
-            <w:tcW w:type="dxa" w:w="1701"/>
+            <w:tcW w:type="dxa" w:w="1361"/>
             <w:shd w:fill="F6F1E7" w:val="clear"/>
           </w:tcPr>
           <w:p>
@@ -2399,13 +2348,13 @@
                 <w:b w:val="0"/>
                 <w:sz w:val="20"/>
               </w:rPr>
-              <w:t>46</w:t>
+              <w:t>114</w:t>
             </w:r>
           </w:p>
         </w:tc>
         <w:tc>
           <w:tcPr>
-            <w:tcW w:type="dxa" w:w="5556"/>
+            <w:tcW w:type="dxa" w:w="5896"/>
             <w:shd w:fill="F6F1E7" w:val="clear"/>
           </w:tcPr>
           <w:p>
@@ -2416,7 +2365,7 @@
                 <w:b w:val="0"/>
                 <w:sz w:val="20"/>
               </w:rPr>
-              <w:t>vətən, qonşu, yurd</w:t>
+              <w:t>El, vətən, qonşu, oba</w:t>
             </w:r>
           </w:p>
         </w:tc>
@@ -2434,13 +2383,13 @@
                 <w:b w:val="0"/>
                 <w:sz w:val="20"/>
               </w:rPr>
-              <w:t>Adət-ənənə</w:t>
+              <w:t>Dostluq</w:t>
             </w:r>
           </w:p>
         </w:tc>
         <w:tc>
           <w:tcPr>
-            <w:tcW w:type="dxa" w:w="1701"/>
+            <w:tcW w:type="dxa" w:w="1361"/>
           </w:tcPr>
           <w:p>
             <w:r/>
@@ -2450,13 +2399,13 @@
                 <w:b w:val="0"/>
                 <w:sz w:val="20"/>
               </w:rPr>
-              <w:t>27</w:t>
+              <w:t>97</w:t>
             </w:r>
           </w:p>
         </w:tc>
         <w:tc>
           <w:tcPr>
-            <w:tcW w:type="dxa" w:w="5556"/>
+            <w:tcW w:type="dxa" w:w="5896"/>
           </w:tcPr>
           <w:p>
             <w:r/>
@@ -2466,7 +2415,7 @@
                 <w:b w:val="0"/>
                 <w:sz w:val="20"/>
               </w:rPr>
-              <w:t>adət, toy, qonaq</w:t>
+              <w:t>Dost, yoldaş, düşmən</w:t>
             </w:r>
           </w:p>
         </w:tc>
@@ -2491,7 +2440,110 @@
         </w:tc>
         <w:tc>
           <w:tcPr>
-            <w:tcW w:type="dxa" w:w="1701"/>
+            <w:tcW w:type="dxa" w:w="1361"/>
+            <w:shd w:fill="F6F1E7" w:val="clear"/>
+          </w:tcPr>
+          <w:p>
+            <w:r/>
+            <w:r>
+              <w:rPr>
+                <w:rFonts w:ascii="Calibri" w:hAnsi="Calibri" w:eastAsia="Calibri"/>
+                <w:b w:val="0"/>
+                <w:sz w:val="20"/>
+              </w:rPr>
+              <w:t>49</w:t>
+            </w:r>
+          </w:p>
+        </w:tc>
+        <w:tc>
+          <w:tcPr>
+            <w:tcW w:type="dxa" w:w="5896"/>
+            <w:shd w:fill="F6F1E7" w:val="clear"/>
+          </w:tcPr>
+          <w:p>
+            <w:r/>
+            <w:r>
+              <w:rPr>
+                <w:rFonts w:ascii="Calibri" w:hAnsi="Calibri" w:eastAsia="Calibri"/>
+                <w:b w:val="0"/>
+                <w:sz w:val="20"/>
+              </w:rPr>
+              <w:t>Zəhmət, sənət, iş</w:t>
+            </w:r>
+          </w:p>
+        </w:tc>
+      </w:tr>
+      <w:tr>
+        <w:tc>
+          <w:tcPr>
+            <w:tcW w:type="dxa" w:w="2381"/>
+          </w:tcPr>
+          <w:p>
+            <w:r/>
+            <w:r>
+              <w:rPr>
+                <w:rFonts w:ascii="Calibri" w:hAnsi="Calibri" w:eastAsia="Calibri"/>
+                <w:b w:val="0"/>
+                <w:sz w:val="20"/>
+              </w:rPr>
+              <w:t>Adət-ənənə</w:t>
+            </w:r>
+          </w:p>
+        </w:tc>
+        <w:tc>
+          <w:tcPr>
+            <w:tcW w:type="dxa" w:w="1361"/>
+          </w:tcPr>
+          <w:p>
+            <w:r/>
+            <w:r>
+              <w:rPr>
+                <w:rFonts w:ascii="Calibri" w:hAnsi="Calibri" w:eastAsia="Calibri"/>
+                <w:b w:val="0"/>
+                <w:sz w:val="20"/>
+              </w:rPr>
+              <w:t>38</w:t>
+            </w:r>
+          </w:p>
+        </w:tc>
+        <w:tc>
+          <w:tcPr>
+            <w:tcW w:type="dxa" w:w="5896"/>
+          </w:tcPr>
+          <w:p>
+            <w:r/>
+            <w:r>
+              <w:rPr>
+                <w:rFonts w:ascii="Calibri" w:hAnsi="Calibri" w:eastAsia="Calibri"/>
+                <w:b w:val="0"/>
+                <w:sz w:val="20"/>
+              </w:rPr>
+              <w:t>Toy, yas, bayram, qonaq</w:t>
+            </w:r>
+          </w:p>
+        </w:tc>
+      </w:tr>
+      <w:tr>
+        <w:tc>
+          <w:tcPr>
+            <w:tcW w:type="dxa" w:w="2381"/>
+            <w:shd w:fill="F6F1E7" w:val="clear"/>
+          </w:tcPr>
+          <w:p>
+            <w:r/>
+            <w:r>
+              <w:rPr>
+                <w:rFonts w:ascii="Calibri" w:hAnsi="Calibri" w:eastAsia="Calibri"/>
+                <w:b w:val="0"/>
+                <w:sz w:val="20"/>
+              </w:rPr>
+              <w:t>Tərbiyə</w:t>
+            </w:r>
+          </w:p>
+        </w:tc>
+        <w:tc>
+          <w:tcPr>
+            <w:tcW w:type="dxa" w:w="1361"/>
             <w:shd w:fill="F6F1E7" w:val="clear"/>
           </w:tcPr>
           <w:p>
@@ -2508,7 +2560,7 @@
         </w:tc>
         <w:tc>
           <w:tcPr>
-            <w:tcW w:type="dxa" w:w="5556"/>
+            <w:tcW w:type="dxa" w:w="5896"/>
             <w:shd w:fill="F6F1E7" w:val="clear"/>
           </w:tcPr>
           <w:p>
@@ -2519,7 +2571,7 @@
                 <w:b w:val="0"/>
                 <w:sz w:val="20"/>
               </w:rPr>
-              <w:t>zəhmət, əmək, sənət, usta</w:t>
+              <w:t>Həya, abır, ədəb, hörmət</w:t>
             </w:r>
           </w:p>
         </w:tc>
@@ -2543,7 +2595,7 @@
         </w:tc>
         <w:tc>
           <w:tcPr>
-            <w:tcW w:type="dxa" w:w="1701"/>
+            <w:tcW w:type="dxa" w:w="1361"/>
           </w:tcPr>
           <w:p>
             <w:r/>
@@ -2553,13 +2605,13 @@
                 <w:b w:val="0"/>
                 <w:sz w:val="20"/>
               </w:rPr>
-              <w:t>19</w:t>
+              <w:t>20</w:t>
             </w:r>
           </w:p>
         </w:tc>
         <w:tc>
           <w:tcPr>
-            <w:tcW w:type="dxa" w:w="5556"/>
+            <w:tcW w:type="dxa" w:w="5896"/>
           </w:tcPr>
           <w:p>
             <w:r/>
@@ -2569,7 +2621,7 @@
                 <w:b w:val="0"/>
                 <w:sz w:val="20"/>
               </w:rPr>
-              <w:t>elm, məktəb, müəllim, kitab, dərs, öyrən</w:t>
+              <w:t>Elm, kitab, müəllim, dərs</w:t>
             </w:r>
           </w:p>
         </w:tc>
@@ -2594,7 +2646,7 @@
         </w:tc>
         <w:tc>
           <w:tcPr>
-            <w:tcW w:type="dxa" w:w="1701"/>
+            <w:tcW w:type="dxa" w:w="1361"/>
             <w:shd w:fill="F6F1E7" w:val="clear"/>
           </w:tcPr>
           <w:p>
@@ -2611,7 +2663,7 @@
         </w:tc>
         <w:tc>
           <w:tcPr>
-            <w:tcW w:type="dxa" w:w="5556"/>
+            <w:tcW w:type="dxa" w:w="5896"/>
             <w:shd w:fill="F6F1E7" w:val="clear"/>
           </w:tcPr>
           <w:p>
@@ -2622,76 +2674,13 @@
                 <w:b w:val="0"/>
                 <w:sz w:val="20"/>
               </w:rPr>
-              <w:t>şərik, ortaq, birlik</w:t>
-            </w:r>
-          </w:p>
-        </w:tc>
-      </w:tr>
-      <w:tr>
-        <w:tc>
-          <w:tcPr>
-            <w:tcW w:type="dxa" w:w="2381"/>
-          </w:tcPr>
-          <w:p>
-            <w:r/>
-            <w:r>
-              <w:rPr>
-                <w:rFonts w:ascii="Calibri" w:hAnsi="Calibri" w:eastAsia="Calibri"/>
-                <w:b w:val="0"/>
-                <w:sz w:val="20"/>
-              </w:rPr>
-              <w:t>Tərbiyə</w:t>
-            </w:r>
-          </w:p>
-        </w:tc>
-        <w:tc>
-          <w:tcPr>
-            <w:tcW w:type="dxa" w:w="1701"/>
-          </w:tcPr>
-          <w:p>
-            <w:r/>
-            <w:r>
-              <w:rPr>
-                <w:rFonts w:ascii="Calibri" w:hAnsi="Calibri" w:eastAsia="Calibri"/>
-                <w:b w:val="0"/>
-                <w:sz w:val="20"/>
-              </w:rPr>
-              <w:t>8</w:t>
-            </w:r>
-          </w:p>
-        </w:tc>
-        <w:tc>
-          <w:tcPr>
-            <w:tcW w:type="dxa" w:w="5556"/>
-          </w:tcPr>
-          <w:p>
-            <w:r/>
-            <w:r>
-              <w:rPr>
-                <w:rFonts w:ascii="Calibri" w:hAnsi="Calibri" w:eastAsia="Calibri"/>
-                <w:b w:val="0"/>
-                <w:sz w:val="20"/>
-              </w:rPr>
-              <w:t>tərbiyə, ədəb, hörmət, nümunə</w:t>
+              <w:t>Şərik, ortaq, birlik</w:t>
             </w:r>
           </w:p>
         </w:tc>
       </w:tr>
     </w:tbl>
     <w:p/>
-    <w:p>
-      <w:pPr>
-        <w:spacing w:after="160" w:before="0" w:line="269" w:lineRule="auto"/>
-      </w:pPr>
-      <w:r>
-        <w:rPr>
-          <w:rFonts w:ascii="Calibri" w:hAnsi="Calibri" w:eastAsia="Calibri"/>
-          <w:b w:val="0"/>
-          <w:sz w:val="22"/>
-        </w:rPr>
-        <w:t>Qüsur, qəbul olunmuş nümunə. «El gücü - sel gücü.» sözü El mövzusunda olmalıdır. Hazırda Əxlaq mövzusundadır, çünki təsnif yalnız «vətən», «qonşu» və «yurd» sözlərini El sayır. «El» sözünün özü qəsdən siyahıya salınmayıb: əks halda «elə», «eləyir» kimi sözlər də Elə düşərdi. Bu bölgü sonrakı əl redaktəsinin predmetidir və hazırkı vəziyyətdə düzgün sayılmır.</w:t>
-      </w:r>
-    </w:p>
     <w:p>
       <w:pPr>
         <w:pStyle w:val="Heading1"/>
@@ -2701,7 +2690,7 @@
           <w:rFonts w:ascii="Calibri" w:hAnsi="Calibri"/>
           <w:color w:val="9C2F2A"/>
         </w:rPr>
-        <w:t>10. İzahların vəziyyəti</w:t>
+        <w:t>9. Arxitektura</w:t>
       </w:r>
     </w:p>
     <w:p>
@@ -2714,32 +2703,7 @@
           <w:b w:val="0"/>
           <w:sz w:val="22"/>
         </w:rPr>
-        <w:t>3925 sözdən 60-nın qısa, əl ilə yazılmış izahı var. 3865 sözdə məna sahəsi «Xalq öyüdü.» olaraq qalıb. Quiz və axtarış bu sahəni göstərir. Yer tutucu olan yerdə bot belə deyir: «Bu atalar sözünün izahı onun öz mənasındadır.» Avtomatik izah qəsdən yazılmayıb, çünki sözün mənasını əyirdi.</w:t>
-      </w:r>
-    </w:p>
-    <w:p>
-      <w:pPr>
-        <w:pStyle w:val="Heading1"/>
-      </w:pPr>
-      <w:r>
-        <w:rPr>
-          <w:rFonts w:ascii="Calibri" w:hAnsi="Calibri"/>
-          <w:color w:val="9C2F2A"/>
-        </w:rPr>
-        <w:t>11. Arxitektura</w:t>
-      </w:r>
-    </w:p>
-    <w:p>
-      <w:pPr>
-        <w:spacing w:after="160" w:before="0" w:line="269" w:lineRule="auto"/>
-      </w:pPr>
-      <w:r>
-        <w:rPr>
-          <w:rFonts w:ascii="Calibri" w:hAnsi="Calibri" w:eastAsia="Calibri"/>
-          <w:b w:val="0"/>
-          <w:sz w:val="22"/>
-        </w:rPr>
-        <w:t>Bir Python prosesi Telegram ilə danışır. Arada veb-server, növbə və ayrıca verilənlər bazası yoxdur.</w:t>
+        <w:t>Bir Python prosesi Telegram ilə danışır. Arada ayrıca veb-server və verilənlər bazası yoxdur.</w:t>
       </w:r>
     </w:p>
     <w:tbl>
@@ -2820,7 +2784,7 @@
                 <w:b w:val="0"/>
                 <w:sz w:val="20"/>
               </w:rPr>
-              <w:t>Python 3. Botun serverində 3.12, geliştirici kompüterində 3.14 işlədilib.</w:t>
+              <w:t>Python 3</w:t>
             </w:r>
           </w:p>
         </w:tc>
@@ -2856,7 +2820,7 @@
                 <w:b w:val="0"/>
                 <w:sz w:val="20"/>
               </w:rPr>
-              <w:t>python-telegram-bot 22.8, job-queue əlavəsi. python-dotenv 1.1.1.</w:t>
+              <w:t>python-telegram-bot 22.8, python-dotenv 1.1.1</w:t>
             </w:r>
           </w:p>
         </w:tc>
@@ -2890,7 +2854,7 @@
                 <w:b w:val="0"/>
                 <w:sz w:val="20"/>
               </w:rPr>
-              <w:t>Long polling. Webhook yoxdur.</w:t>
+              <w:t>Long polling</w:t>
             </w:r>
           </w:p>
         </w:tc>
@@ -2909,7 +2873,7 @@
                 <w:b w:val="0"/>
                 <w:sz w:val="20"/>
               </w:rPr>
-              <w:t>Vəziyyət</w:t>
+              <w:t>Vaxt</w:t>
             </w:r>
           </w:p>
         </w:tc>
@@ -2926,7 +2890,7 @@
                 <w:b w:val="0"/>
                 <w:sz w:val="20"/>
               </w:rPr>
-              <w:t>Söhbət vəziyyəti: menyu, açar söz, hekayə, quiz.</w:t>
+              <w:t>Bakı, UTC+4</w:t>
             </w:r>
           </w:p>
         </w:tc>
@@ -2944,7 +2908,7 @@
                 <w:b w:val="0"/>
                 <w:sz w:val="20"/>
               </w:rPr>
-              <w:t>Vaxt</w:t>
+              <w:t>Saxlama</w:t>
             </w:r>
           </w:p>
         </w:tc>
@@ -2960,7 +2924,7 @@
                 <w:b w:val="0"/>
                 <w:sz w:val="20"/>
               </w:rPr>
-              <w:t>Günün sözü Bakı saat qurşağı, UTC+4.</w:t>
+              <w:t>proverbs.json. Token yalnız .env faylında.</w:t>
             </w:r>
           </w:p>
         </w:tc>
@@ -2979,7 +2943,7 @@
                 <w:b w:val="0"/>
                 <w:sz w:val="20"/>
               </w:rPr>
-              <w:t>Saxlama</w:t>
+              <w:t>Proses</w:t>
             </w:r>
           </w:p>
         </w:tc>
@@ -2996,7 +2960,7 @@
                 <w:b w:val="0"/>
                 <w:sz w:val="20"/>
               </w:rPr>
-              <w:t>proverbs.json. Token yalnız .env faylında, EnvironmentFile ilə.</w:t>
+              <w:t>systemd, istifadəçi bot, Restart=always, RestartSec=5</w:t>
             </w:r>
           </w:p>
         </w:tc>
@@ -3014,7 +2978,7 @@
                 <w:b w:val="0"/>
                 <w:sz w:val="20"/>
               </w:rPr>
-              <w:t>Proses</w:t>
+              <w:t>Ünvan</w:t>
             </w:r>
           </w:p>
         </w:tc>
@@ -3030,7 +2994,7 @@
                 <w:b w:val="0"/>
                 <w:sz w:val="20"/>
               </w:rPr>
-              <w:t>systemd, User=bot, Restart=always, RestartSec=5.</w:t>
+              <w:t>/home/bot/atalar-sozu-bot</w:t>
             </w:r>
           </w:p>
         </w:tc>
@@ -3047,7 +3011,7 @@
           <w:b w:val="0"/>
           <w:sz w:val="22"/>
         </w:rPr>
-        <w:t>Əsas fayllar: bot.py söhbəti aparır, proverbs.json bazadır, requirements.txt asılılıqdır, deploy/atalar-sozu-bot.service xidmət təyinidir. .env repozitoriyaya düşmür.</w:t>
+        <w:t>Əsas fayllar: bot.py söhbəti aparır, proverbs.json bazadır, requirements.txt asılılıqdır, deploy/atalar-sozu-bot.service xidmət təyinidir.</w:t>
       </w:r>
     </w:p>
     <w:p>
@@ -3059,7 +3023,7 @@
           <w:rFonts w:ascii="Calibri" w:hAnsi="Calibri"/>
           <w:color w:val="9C2F2A"/>
         </w:rPr>
-        <w:t>12. Yerləşdirmə və yeniləmə</w:t>
+        <w:t>10. Yeniləmə</w:t>
       </w:r>
     </w:p>
     <w:p>
@@ -3072,20 +3036,7 @@
           <w:b w:val="0"/>
           <w:sz w:val="22"/>
         </w:rPr>
-        <w:t>Server Ubuntu 24.04-dür. Kod /home/bot/atalar-sozu-bot qovluğundadır. Virtual mühit .venv-dir. Xidmət adı atalar-sozu-bot.service-dir.</w:t>
-      </w:r>
-    </w:p>
-    <w:p>
-      <w:pPr>
-        <w:spacing w:after="160" w:before="0" w:line="269" w:lineRule="auto"/>
-      </w:pPr>
-      <w:r>
-        <w:rPr>
-          <w:rFonts w:ascii="Calibri" w:hAnsi="Calibri" w:eastAsia="Calibri"/>
-          <w:b w:val="0"/>
-          <w:sz w:val="22"/>
-        </w:rPr>
-        <w:t>Yeniləmə iki əmrlə bitir. Əmrlər serverin öz terminalında, root sessiyasında yazılır, Windows PowerShell-də yox:</w:t>
+        <w:t>Server Ubuntu 24.04-dür. Yeniləmə serverin öz terminalında, iki əmrlə bitir.</w:t>
       </w:r>
     </w:p>
     <w:p>
@@ -3124,7 +3075,7 @@
           <w:b w:val="0"/>
           <w:sz w:val="22"/>
         </w:rPr>
-        <w:t>Yoxlama: systemctl status atalar-sozu-bot və jurnalın son sətirləri. Jurnalda bot tokeni görünə bilər. Həmin sətir başqasına göndərilmir. Token dəyişəndə köhnə token BotFather-də ləğv edilir, yeni token yalnız serverdəki .env faylına yazılır.</w:t>
+        <w:t>Yoxlama systemctl status atalar-sozu-bot və jurnalın son sətirləri ilə aparılır. Token jurnala düşə bilər. Həmin sətir başqasına göndərilmir.</w:t>
       </w:r>
     </w:p>
     <w:p>
@@ -3136,7 +3087,7 @@
           <w:rFonts w:ascii="Calibri" w:hAnsi="Calibri"/>
           <w:color w:val="9C2F2A"/>
         </w:rPr>
-        <w:t>13. Təhlükəsizlik</w:t>
+        <w:t>11. Təhlükəsizlik</w:t>
       </w:r>
     </w:p>
     <w:p>
@@ -3149,7 +3100,7 @@
           <w:b w:val="0"/>
           <w:sz w:val="22"/>
         </w:rPr>
-        <w:t>• BOT_TOKEN git-ə, sənədə və söhbətə yazılmır.</w:t>
+        <w:t>• BOT_TOKEN git-ə və bu sənədə yazılmır.</w:t>
       </w:r>
     </w:p>
     <w:p>
@@ -3162,7 +3113,7 @@
           <w:b w:val="0"/>
           <w:sz w:val="22"/>
         </w:rPr>
-        <w:t>• Xidmət root kimi yox, bot istifadəçisi kimi işləyir.</w:t>
+        <w:t>• Xidmət bot istifadəçisi kimi işləyir, root kimi yox.</w:t>
       </w:r>
     </w:p>
     <w:p>
@@ -3175,7 +3126,7 @@
           <w:b w:val="0"/>
           <w:sz w:val="22"/>
         </w:rPr>
-        <w:t>• Bot yalnız Telegram API-sinə çıxır. Gələn mətn əmr kimi icra olunmur.</w:t>
+        <w:t>• Gələn mətn əmr kimi icra olunmur.</w:t>
       </w:r>
     </w:p>
     <w:p>
@@ -3188,7 +3139,7 @@
           <w:b w:val="0"/>
           <w:sz w:val="22"/>
         </w:rPr>
-        <w:t>• İstifadəçi mətni bazaya yazılmır. Quiz cavabı yalnız yoxlanılır.</w:t>
+        <w:t>• İstifadəçi mətni bazaya yazılmır.</w:t>
       </w:r>
     </w:p>
     <w:p>
@@ -3201,7 +3152,7 @@
           <w:b w:val="0"/>
           <w:sz w:val="22"/>
         </w:rPr>
-        <w:t>• Xəta olanda istifadəçiyə ümumi cümlə deyilir, iz steki göndərilmir.</w:t>
+        <w:t>• Xəta olanda istifadəçiyə ümumi cümlə deyilir.</w:t>
       </w:r>
     </w:p>
     <w:p>
@@ -3213,7 +3164,7 @@
           <w:rFonts w:ascii="Calibri" w:hAnsi="Calibri"/>
           <w:color w:val="9C2F2A"/>
         </w:rPr>
-        <w:t>14. Qəbul meyarları</w:t>
+        <w:t>12. Qəbul</w:t>
       </w:r>
     </w:p>
     <w:tbl>
@@ -3294,7 +3245,7 @@
                 <w:b w:val="0"/>
                 <w:sz w:val="20"/>
               </w:rPr>
-              <w:t>«Bazada indi 3925 atalar sözü var.»</w:t>
+              <w:t>Bazada 3913 atalar sözü.</w:t>
             </w:r>
           </w:p>
         </w:tc>
@@ -3313,7 +3264,7 @@
                 <w:b w:val="0"/>
                 <w:sz w:val="20"/>
               </w:rPr>
-              <w:t>Açar söz: qonşu</w:t>
+              <w:t>Açar söz</w:t>
             </w:r>
           </w:p>
         </w:tc>
@@ -3348,7 +3299,7 @@
                 <w:b w:val="0"/>
                 <w:sz w:val="20"/>
               </w:rPr>
-              <w:t>Mövzular → El</w:t>
+              <w:t>Mövzular</w:t>
             </w:r>
           </w:p>
         </w:tc>
@@ -3364,7 +3315,7 @@
                 <w:b w:val="0"/>
                 <w:sz w:val="20"/>
               </w:rPr>
-              <w:t>Düymədə (46). Siyahı 15-15 açılır.</w:t>
+              <w:t>On iki düymə, hər birində say.</w:t>
             </w:r>
           </w:p>
         </w:tc>
@@ -3383,7 +3334,7 @@
                 <w:b w:val="0"/>
                 <w:sz w:val="20"/>
               </w:rPr>
-              <w:t>Quiz, səhv söz</w:t>
+              <w:t>Quiz, düz söz</w:t>
             </w:r>
           </w:p>
         </w:tc>
@@ -3400,7 +3351,7 @@
                 <w:b w:val="0"/>
                 <w:sz w:val="20"/>
               </w:rPr>
-              <w:t>Cavab açılmır, sual qalır.</w:t>
+              <w:t>Təbrik və izah.</w:t>
             </w:r>
           </w:p>
         </w:tc>
@@ -3434,7 +3385,7 @@
                 <w:b w:val="0"/>
                 <w:sz w:val="20"/>
               </w:rPr>
-              <w:t>Çatışmayan söz və izah görünür.</w:t>
+              <w:t>Çatışmayan söz və izah.</w:t>
             </w:r>
           </w:p>
         </w:tc>
@@ -3470,7 +3421,7 @@
                 <w:b w:val="0"/>
                 <w:sz w:val="20"/>
               </w:rPr>
-              <w:t>Növbəti səhər 09:00-da bir söz düşür.</w:t>
+              <w:t>Hər səhər 09:00-da bir söz.</w:t>
             </w:r>
           </w:p>
         </w:tc>
@@ -3513,19 +3464,7 @@
     <w:p/>
     <w:p>
       <w:pPr>
-        <w:pStyle w:val="Heading1"/>
-      </w:pPr>
-      <w:r>
-        <w:rPr>
-          <w:rFonts w:ascii="Calibri" w:hAnsi="Calibri"/>
-          <w:color w:val="9C2F2A"/>
-        </w:rPr>
-        <w:t>15. Açıq işlər</w:t>
-      </w:r>
-    </w:p>
-    <w:p>
-      <w:pPr>
-        <w:spacing w:after="160" w:before="0" w:line="269" w:lineRule="auto"/>
+        <w:spacing w:after="160" w:before="160" w:line="269" w:lineRule="auto"/>
       </w:pPr>
       <w:r>
         <w:rPr>
@@ -3533,187 +3472,7 @@
           <w:b w:val="0"/>
           <w:sz w:val="22"/>
         </w:rPr>
-        <w:t>Bunlar hazırkı buraxılışın qəsdən saxlanmış boşluqlarıdır. Bot onlarsız da işləyir. Növbəti redaktənin sırası belədir.</w:t>
-      </w:r>
-    </w:p>
-    <w:tbl>
-      <w:tblPr>
-        <w:tblStyle w:val="TableGrid"/>
-        <w:tblW w:type="auto" w:w="0"/>
-        <w:jc w:val="center"/>
-        <w:tblLook w:firstColumn="1" w:firstRow="1" w:lastColumn="0" w:lastRow="0" w:noHBand="0" w:noVBand="1" w:val="04A0"/>
-      </w:tblPr>
-      <w:tblGrid>
-        <w:gridCol w:w="4819"/>
-        <w:gridCol w:w="4819"/>
-      </w:tblGrid>
-      <w:tr>
-        <w:tc>
-          <w:tcPr>
-            <w:tcW w:type="dxa" w:w="2948"/>
-            <w:shd w:fill="1A1614" w:val="clear"/>
-          </w:tcPr>
-          <w:p>
-            <w:r/>
-            <w:r>
-              <w:rPr>
-                <w:rFonts w:ascii="Calibri" w:hAnsi="Calibri" w:eastAsia="Calibri"/>
-                <w:b/>
-                <w:color w:val="FFFFFF"/>
-                <w:sz w:val="20"/>
-              </w:rPr>
-              <w:t>İş</w:t>
-            </w:r>
-          </w:p>
-        </w:tc>
-        <w:tc>
-          <w:tcPr>
-            <w:tcW w:type="dxa" w:w="6690"/>
-            <w:shd w:fill="1A1614" w:val="clear"/>
-          </w:tcPr>
-          <w:p>
-            <w:r/>
-            <w:r>
-              <w:rPr>
-                <w:rFonts w:ascii="Calibri" w:hAnsi="Calibri" w:eastAsia="Calibri"/>
-                <w:b/>
-                <w:color w:val="FFFFFF"/>
-                <w:sz w:val="20"/>
-              </w:rPr>
-              <w:t>Nə üçün</w:t>
-            </w:r>
-          </w:p>
-        </w:tc>
-      </w:tr>
-      <w:tr>
-        <w:tc>
-          <w:tcPr>
-            <w:tcW w:type="dxa" w:w="2948"/>
-          </w:tcPr>
-          <w:p>
-            <w:r/>
-            <w:r>
-              <w:rPr>
-                <w:rFonts w:ascii="Calibri" w:hAnsi="Calibri" w:eastAsia="Calibri"/>
-                <w:b w:val="0"/>
-                <w:sz w:val="20"/>
-              </w:rPr>
-              <w:t>Mövzuları əl ilə düzəltmək</w:t>
-            </w:r>
-          </w:p>
-        </w:tc>
-        <w:tc>
-          <w:tcPr>
-            <w:tcW w:type="dxa" w:w="6690"/>
-          </w:tcPr>
-          <w:p>
-            <w:r/>
-            <w:r>
-              <w:rPr>
-                <w:rFonts w:ascii="Calibri" w:hAnsi="Calibri" w:eastAsia="Calibri"/>
-                <w:b w:val="0"/>
-                <w:sz w:val="20"/>
-              </w:rPr>
-              <w:t>«El gücü - sel gücü» Əxlaqdadır. Avtomatik qayda bunu tutmur. 3324 sözün çoxu eyni səbəbdən Əxlaqa yığılıb.</w:t>
-            </w:r>
-          </w:p>
-        </w:tc>
-      </w:tr>
-      <w:tr>
-        <w:tc>
-          <w:tcPr>
-            <w:tcW w:type="dxa" w:w="2948"/>
-            <w:shd w:fill="F6F1E7" w:val="clear"/>
-          </w:tcPr>
-          <w:p>
-            <w:r/>
-            <w:r>
-              <w:rPr>
-                <w:rFonts w:ascii="Calibri" w:hAnsi="Calibri" w:eastAsia="Calibri"/>
-                <w:b w:val="0"/>
-                <w:sz w:val="20"/>
-              </w:rPr>
-              <w:t>İzahları hissə-hissə yazmaq</w:t>
-            </w:r>
-          </w:p>
-        </w:tc>
-        <w:tc>
-          <w:tcPr>
-            <w:tcW w:type="dxa" w:w="6690"/>
-            <w:shd w:fill="F6F1E7" w:val="clear"/>
-          </w:tcPr>
-          <w:p>
-            <w:r/>
-            <w:r>
-              <w:rPr>
-                <w:rFonts w:ascii="Calibri" w:hAnsi="Calibri" w:eastAsia="Calibri"/>
-                <w:b w:val="0"/>
-                <w:sz w:val="20"/>
-              </w:rPr>
-              <w:t>3865 sözdə hələ yer tutucu var. Avtomatik cümlə mənanı pozduğu üçün əl ilə yazılır.</w:t>
-            </w:r>
-          </w:p>
-        </w:tc>
-      </w:tr>
-      <w:tr>
-        <w:tc>
-          <w:tcPr>
-            <w:tcW w:type="dxa" w:w="2948"/>
-          </w:tcPr>
-          <w:p>
-            <w:r/>
-            <w:r>
-              <w:rPr>
-                <w:rFonts w:ascii="Calibri" w:hAnsi="Calibri" w:eastAsia="Calibri"/>
-                <w:b w:val="0"/>
-                <w:sz w:val="20"/>
-              </w:rPr>
-              <w:t>Pozuq durğu işarələri</w:t>
-            </w:r>
-          </w:p>
-        </w:tc>
-        <w:tc>
-          <w:tcPr>
-            <w:tcW w:type="dxa" w:w="6690"/>
-          </w:tcPr>
-          <w:p>
-            <w:r/>
-            <w:r>
-              <w:rPr>
-                <w:rFonts w:ascii="Calibri" w:hAnsi="Calibri" w:eastAsia="Calibri"/>
-                <w:b w:val="0"/>
-                <w:sz w:val="20"/>
-              </w:rPr>
-              <w:t>PDF şriftindən qalan bəzi sual işarələri sözün ortasında qalıb. Mətn redaktəsi lazımdır.</w:t>
-            </w:r>
-          </w:p>
-        </w:tc>
-      </w:tr>
-    </w:tbl>
-    <w:p/>
-    <w:p>
-      <w:pPr>
-        <w:pStyle w:val="Heading1"/>
-      </w:pPr>
-      <w:r>
-        <w:rPr>
-          <w:rFonts w:ascii="Calibri" w:hAnsi="Calibri"/>
-          <w:color w:val="9C2F2A"/>
-        </w:rPr>
-        <w:t>16. Sənədin həddi</w:t>
-      </w:r>
-    </w:p>
-    <w:p>
-      <w:pPr>
-        <w:spacing w:after="160" w:before="0" w:line="269" w:lineRule="auto"/>
-      </w:pPr>
-      <w:r>
-        <w:rPr>
-          <w:rFonts w:ascii="Calibri" w:hAnsi="Calibri" w:eastAsia="Calibri"/>
-          <w:b w:val="0"/>
-          <w:sz w:val="22"/>
-        </w:rPr>
-        <w:t>Bu sənəd 27 sentyabr 2026 tarixində işləyən kodun təsviridir. Mövzu sayları və söz sayı proverbs.json faylından götürülüb. Kod dəyişəndə sənəd də dəyişməlidir. Token, server ünvanı və şəxsi giriş bu sənədə salınmayıb.</w:t>
+        <w:t>Bu sənəd 27 sentyabr 2026 tarixində işləyən sistemin təsviridir. Söz sayı və mövzu sayları proverbs.json faylından götürülüb. Token və server ünvanı sənədə salınmayıb.</w:t>
       </w:r>
     </w:p>
     <w:sectPr>

</xml_diff>